<commit_message>
Phase 1b - Template_FR: mise en page corrigee
- Compétences enfin visibles (syntaxe RichText {{r x }} au lieu de {{ r(x) }})
- Bloc titre/résidence/langues déplacé sur la page de garde (ancré au paragraphe du nom)
- Espacement compétences resserré (catégorie collée aux puces, 1 saut entre groupes)
- Suppression de la page blanche finale
</commit_message>
<xml_diff>
--- a/Template_FR.docx
+++ b/Template_FR.docx
@@ -538,95 +538,6 @@
           </mc:Fallback>
         </mc:AlternateContent>
       </w:r>
-    </w:p>
-    <w:p>
-      <w:pPr>
-        <w:rPr>
-          <w:lang w:val="en-US"/>
-        </w:rPr>
-      </w:pPr>
-    </w:p>
-    <w:p>
-      <w:pPr>
-        <w:rPr>
-          <w:lang w:val="en-US"/>
-        </w:rPr>
-      </w:pPr>
-    </w:p>
-    <w:p>
-      <w:pPr>
-        <w:rPr>
-          <w:lang w:val="en-US"/>
-        </w:rPr>
-      </w:pPr>
-    </w:p>
-    <w:p>
-      <w:pPr>
-        <w:rPr>
-          <w:lang w:val="en-US"/>
-        </w:rPr>
-      </w:pPr>
-    </w:p>
-    <w:p>
-      <w:pPr>
-        <w:rPr>
-          <w:lang w:val="en-US"/>
-        </w:rPr>
-      </w:pPr>
-    </w:p>
-    <w:p>
-      <w:pPr>
-        <w:rPr>
-          <w:lang w:val="en-US"/>
-        </w:rPr>
-      </w:pPr>
-    </w:p>
-    <w:p>
-      <w:pPr>
-        <w:rPr>
-          <w:lang w:val="en-US"/>
-        </w:rPr>
-      </w:pPr>
-    </w:p>
-    <w:p>
-      <w:pPr>
-        <w:rPr>
-          <w:lang w:val="en-US"/>
-        </w:rPr>
-      </w:pPr>
-    </w:p>
-    <w:p>
-      <w:pPr>
-        <w:rPr>
-          <w:lang w:val="en-US"/>
-        </w:rPr>
-      </w:pPr>
-    </w:p>
-    <w:p>
-      <w:pPr>
-        <w:rPr>
-          <w:lang w:val="en-US"/>
-        </w:rPr>
-      </w:pPr>
-    </w:p>
-    <w:p>
-      <w:pPr>
-        <w:rPr>
-          <w:lang w:val="en-US"/>
-        </w:rPr>
-      </w:pPr>
-    </w:p>
-    <w:p>
-      <w:pPr>
-        <w:spacing w:after="240"/>
-        <w:rPr>
-          <w:rStyle w:val="PageNumber"/>
-          <w:color w:val="033247"/>
-          <w:sz w:val="18"/>
-          <w:szCs w:val="22"/>
-          <w:lang w:val="en-US"/>
-        </w:rPr>
-      </w:pPr>
       <w:r>
         <w:rPr>
           <w:noProof/>
@@ -642,7 +553,7 @@
                   <wp:posOffset>-131173</wp:posOffset>
                 </wp:positionH>
                 <wp:positionV relativeFrom="paragraph">
-                  <wp:posOffset>375739</wp:posOffset>
+                  <wp:posOffset>1728000</wp:posOffset>
                 </wp:positionV>
                 <wp:extent cx="5942712" cy="4412342"/>
                 <wp:effectExtent l="0" t="0" r="0" b="0"/>
@@ -1080,7 +991,7 @@
           </mc:Choice>
           <mc:Fallback>
             <w:pict>
-              <v:shape w14:anchorId="131AED36" id="Tekstvak 3" o:spid="_x0000_s1029" type="#_x0000_t202" style="position:absolute;margin-left:-10.35pt;margin-top:29.6pt;width:467.95pt;height:347.45pt;z-index:251681792;visibility:visible;mso-wrap-style:square;mso-height-percent:0;mso-wrap-distance-left:9pt;mso-wrap-distance-top:0;mso-wrap-distance-right:9pt;mso-wrap-distance-bottom:0;mso-position-horizontal:absolute;mso-position-horizontal-relative:text;mso-position-vertical:absolute;mso-position-vertical-relative:text;mso-height-percent:0;mso-height-relative:margin;v-text-anchor:top" o:gfxdata="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" filled="f" stroked="f">
+              <v:shape w14:anchorId="131AED36" id="Tekstvak 3" o:spid="_x0000_s1029" type="#_x0000_t202" style="position:absolute;margin-left:-10.35pt;margin-top:136pt;width:467.95pt;height:347.45pt;z-index:251681792;visibility:visible;mso-wrap-style:square;mso-height-percent:0;mso-wrap-distance-left:9pt;mso-wrap-distance-top:0;mso-wrap-distance-right:9pt;mso-wrap-distance-bottom:0;mso-position-horizontal:absolute;mso-position-horizontal-relative:text;mso-position-vertical:absolute;mso-position-vertical-relative:text;mso-height-percent:0;mso-height-relative:margin;v-text-anchor:top" o:gfxdata="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" filled="f" stroked="f">
                 <v:textbox>
                   <w:txbxContent>
                     <w:p>
@@ -1468,6 +1379,95 @@
           </mc:Fallback>
         </mc:AlternateContent>
       </w:r>
+    </w:p>
+    <w:p>
+      <w:pPr>
+        <w:rPr>
+          <w:lang w:val="en-US"/>
+        </w:rPr>
+      </w:pPr>
+    </w:p>
+    <w:p>
+      <w:pPr>
+        <w:rPr>
+          <w:lang w:val="en-US"/>
+        </w:rPr>
+      </w:pPr>
+    </w:p>
+    <w:p>
+      <w:pPr>
+        <w:rPr>
+          <w:lang w:val="en-US"/>
+        </w:rPr>
+      </w:pPr>
+    </w:p>
+    <w:p>
+      <w:pPr>
+        <w:rPr>
+          <w:lang w:val="en-US"/>
+        </w:rPr>
+      </w:pPr>
+    </w:p>
+    <w:p>
+      <w:pPr>
+        <w:rPr>
+          <w:lang w:val="en-US"/>
+        </w:rPr>
+      </w:pPr>
+    </w:p>
+    <w:p>
+      <w:pPr>
+        <w:rPr>
+          <w:lang w:val="en-US"/>
+        </w:rPr>
+      </w:pPr>
+    </w:p>
+    <w:p>
+      <w:pPr>
+        <w:rPr>
+          <w:lang w:val="en-US"/>
+        </w:rPr>
+      </w:pPr>
+    </w:p>
+    <w:p>
+      <w:pPr>
+        <w:rPr>
+          <w:lang w:val="en-US"/>
+        </w:rPr>
+      </w:pPr>
+    </w:p>
+    <w:p>
+      <w:pPr>
+        <w:rPr>
+          <w:lang w:val="en-US"/>
+        </w:rPr>
+      </w:pPr>
+    </w:p>
+    <w:p>
+      <w:pPr>
+        <w:rPr>
+          <w:lang w:val="en-US"/>
+        </w:rPr>
+      </w:pPr>
+    </w:p>
+    <w:p>
+      <w:pPr>
+        <w:rPr>
+          <w:lang w:val="en-US"/>
+        </w:rPr>
+      </w:pPr>
+    </w:p>
+    <w:p>
+      <w:pPr>
+        <w:spacing w:after="240"/>
+        <w:rPr>
+          <w:rStyle w:val="PageNumber"/>
+          <w:color w:val="033247"/>
+          <w:sz w:val="18"/>
+          <w:szCs w:val="22"/>
+          <w:lang w:val="en-US"/>
+        </w:rPr>
+      </w:pPr>
       <w:r>
         <w:rPr>
           <w:noProof/>
@@ -2198,11 +2198,12 @@
           <w:szCs w:val="20"/>
         </w:rPr>
         <w:br/>
-        <w:t>{% for category, skills in skills_categorized_doc %}</w:t>
+        <w:t>{%p for category, skills in skills_categorized_doc %}</w:t>
       </w:r>
     </w:p>
     <w:p>
       <w:pPr>
+        <w:spacing w:before="120" w:after="0" w:line="240" w:lineRule="auto"/>
         <w:rPr>
           <w:szCs w:val="20"/>
         </w:rPr>
@@ -2211,7 +2212,7 @@
         <w:rPr>
           <w:szCs w:val="20"/>
         </w:rPr>
-        <w:t>{{ r(category) }}</w:t>
+        <w:t>{{r category }}</w:t>
       </w:r>
       <w:r>
         <w:rPr>
@@ -2228,6 +2229,7 @@
     </w:p>
     <w:p>
       <w:pPr>
+        <w:spacing w:before="0" w:after="0" w:line="240" w:lineRule="auto"/>
         <w:pStyle w:val="ListParagraph"/>
         <w:numPr>
           <w:ilvl w:val="0"/>
@@ -2241,7 +2243,7 @@
         <w:rPr>
           <w:szCs w:val="20"/>
         </w:rPr>
-        <w:t>{{ r(skill) }}</w:t>
+        <w:t>{{r skill }}</w:t>
       </w:r>
     </w:p>
     <w:p>
@@ -2274,7 +2276,7 @@
         <w:rPr>
           <w:szCs w:val="20"/>
         </w:rPr>
-        <w:t>{% endfor %}</w:t>
+        <w:t>{%p endfor %}</w:t>
       </w:r>
     </w:p>
     <w:p>
@@ -3302,160 +3304,6 @@
         </w:tc>
       </w:tr>
     </w:tbl>
-    <w:p>
-      <w:pPr>
-        <w:pStyle w:val="Body"/>
-        <w:rPr>
-          <w:rStyle w:val="PageNumber"/>
-          <w:rFonts w:ascii="Arial" w:hAnsi="Arial" w:cs="Arial"/>
-          <w:b/>
-          <w:bCs/>
-          <w:color w:val="033247"/>
-          <w:u w:color="033247"/>
-          <w:lang w:val="en-CA"/>
-        </w:rPr>
-      </w:pPr>
-    </w:p>
-    <w:p>
-      <w:pPr>
-        <w:pStyle w:val="Body"/>
-        <w:rPr>
-          <w:rStyle w:val="PageNumber"/>
-          <w:rFonts w:ascii="Arial" w:hAnsi="Arial" w:cs="Arial"/>
-          <w:b/>
-          <w:bCs/>
-          <w:color w:val="033247"/>
-          <w:u w:color="033247"/>
-          <w:lang w:val="en-CA"/>
-        </w:rPr>
-      </w:pPr>
-    </w:p>
-    <w:p>
-      <w:pPr>
-        <w:pStyle w:val="Body"/>
-        <w:rPr>
-          <w:rStyle w:val="PageNumber"/>
-          <w:rFonts w:ascii="Arial" w:hAnsi="Arial" w:cs="Arial"/>
-          <w:b/>
-          <w:bCs/>
-          <w:color w:val="033247"/>
-          <w:u w:color="033247"/>
-          <w:lang w:val="en-CA"/>
-        </w:rPr>
-      </w:pPr>
-    </w:p>
-    <w:p>
-      <w:pPr>
-        <w:pStyle w:val="Body"/>
-        <w:rPr>
-          <w:rStyle w:val="PageNumber"/>
-          <w:rFonts w:ascii="Arial" w:hAnsi="Arial" w:cs="Arial"/>
-          <w:b/>
-          <w:bCs/>
-          <w:color w:val="033247"/>
-          <w:u w:color="033247"/>
-          <w:lang w:val="en-CA"/>
-        </w:rPr>
-      </w:pPr>
-    </w:p>
-    <w:p>
-      <w:pPr>
-        <w:pStyle w:val="Body"/>
-        <w:rPr>
-          <w:rStyle w:val="PageNumber"/>
-          <w:rFonts w:ascii="Arial" w:hAnsi="Arial" w:cs="Arial"/>
-          <w:b/>
-          <w:bCs/>
-          <w:color w:val="033247"/>
-          <w:u w:color="033247"/>
-          <w:lang w:val="en-CA"/>
-        </w:rPr>
-      </w:pPr>
-    </w:p>
-    <w:p>
-      <w:pPr>
-        <w:pStyle w:val="Body"/>
-        <w:rPr>
-          <w:rStyle w:val="PageNumber"/>
-          <w:rFonts w:ascii="Arial" w:hAnsi="Arial" w:cs="Arial"/>
-          <w:b/>
-          <w:bCs/>
-          <w:color w:val="033247"/>
-          <w:u w:color="033247"/>
-          <w:lang w:val="en-CA"/>
-        </w:rPr>
-      </w:pPr>
-    </w:p>
-    <w:p>
-      <w:pPr>
-        <w:pStyle w:val="Body"/>
-        <w:rPr>
-          <w:rStyle w:val="PageNumber"/>
-          <w:rFonts w:ascii="Arial" w:hAnsi="Arial" w:cs="Arial"/>
-          <w:b/>
-          <w:bCs/>
-          <w:color w:val="033247"/>
-          <w:u w:color="033247"/>
-          <w:lang w:val="en-CA"/>
-        </w:rPr>
-      </w:pPr>
-    </w:p>
-    <w:p>
-      <w:pPr>
-        <w:pStyle w:val="Body"/>
-        <w:rPr>
-          <w:rStyle w:val="PageNumber"/>
-          <w:rFonts w:ascii="Arial" w:hAnsi="Arial" w:cs="Arial"/>
-          <w:b/>
-          <w:bCs/>
-          <w:color w:val="033247"/>
-          <w:u w:color="033247"/>
-          <w:lang w:val="en-CA"/>
-        </w:rPr>
-      </w:pPr>
-    </w:p>
-    <w:p>
-      <w:pPr>
-        <w:pStyle w:val="Body"/>
-        <w:rPr>
-          <w:rStyle w:val="PageNumber"/>
-          <w:rFonts w:ascii="Arial" w:hAnsi="Arial" w:cs="Arial"/>
-          <w:b/>
-          <w:bCs/>
-          <w:color w:val="033247"/>
-          <w:u w:color="033247"/>
-          <w:lang w:val="en-CA"/>
-        </w:rPr>
-      </w:pPr>
-    </w:p>
-    <w:p>
-      <w:pPr>
-        <w:pStyle w:val="Body"/>
-        <w:rPr>
-          <w:rStyle w:val="PageNumber"/>
-          <w:rFonts w:ascii="Arial" w:hAnsi="Arial" w:cs="Arial"/>
-          <w:b/>
-          <w:bCs/>
-          <w:color w:val="033247"/>
-          <w:u w:color="033247"/>
-          <w:lang w:val="en-CA"/>
-        </w:rPr>
-      </w:pPr>
-    </w:p>
-    <w:p>
-      <w:pPr>
-        <w:pStyle w:val="Body"/>
-        <w:rPr>
-          <w:rStyle w:val="PageNumber"/>
-          <w:rFonts w:ascii="Arial" w:hAnsi="Arial" w:cs="Arial"/>
-          <w:b/>
-          <w:bCs/>
-          <w:color w:val="033247"/>
-          <w:u w:color="033247"/>
-          <w:lang w:val="en-CA"/>
-        </w:rPr>
-      </w:pPr>
-    </w:p>
     <w:sectPr>
       <w:headerReference w:type="default" r:id="rId11"/>
       <w:footerReference w:type="even" r:id="rId12"/>

</xml_diff>